<commit_message>
refactor:Ajustes finales en scripts de bd
</commit_message>
<xml_diff>
--- a/documents/SCV-Documentacion-Tecnica-Backend.docx
+++ b/documents/SCV-Documentacion-Tecnica-Backend.docx
@@ -56,18 +56,42 @@
         <w:spacing w:after="2400"/>
         <w:jc w:val="center"/>
         <w:rPr>
-          <w:lang w:val="es-BO"/>
-        </w:rPr>
-      </w:pPr>
-      <w:r>
-        <w:rPr>
           <w:i/>
           <w:iCs/>
           <w:color w:val="475569"/>
           <w:lang w:val="es-BO"/>
         </w:rPr>
+      </w:pPr>
+      <w:r>
+        <w:rPr>
+          <w:i/>
+          <w:iCs/>
+          <w:color w:val="475569"/>
+          <w:lang w:val="es-BO"/>
+        </w:rPr>
         <w:t>Arquitectura en capas, servicios, modelo de datos e integraciones</w:t>
       </w:r>
+    </w:p>
+    <w:p>
+      <w:pPr>
+        <w:spacing w:after="2400"/>
+        <w:jc w:val="center"/>
+        <w:rPr>
+          <w:i/>
+          <w:iCs/>
+          <w:color w:val="475569"/>
+          <w:lang w:val="es-BO"/>
+        </w:rPr>
+      </w:pPr>
+    </w:p>
+    <w:p>
+      <w:pPr>
+        <w:spacing w:after="2400"/>
+        <w:jc w:val="center"/>
+        <w:rPr>
+          <w:lang w:val="es-BO"/>
+        </w:rPr>
+      </w:pPr>
     </w:p>
     <w:p>
       <w:pPr>
@@ -87,7 +111,7 @@
         <w:pStyle w:val="Heading1"/>
         <w:spacing w:before="360" w:after="180"/>
       </w:pPr>
-      <w:bookmarkStart w:id="0" w:name="_Toc239726791"/>
+      <w:bookmarkStart w:id="0" w:name="_Toc239876598"/>
       <w:proofErr w:type="spellStart"/>
       <w:r>
         <w:lastRenderedPageBreak/>
@@ -126,7 +150,7 @@
           <w:r>
             <w:fldChar w:fldCharType="separate"/>
           </w:r>
-          <w:hyperlink w:anchor="_Toc239726791" w:history="1">
+          <w:hyperlink w:anchor="_Toc239876598" w:history="1">
             <w:r>
               <w:rPr>
                 <w:rStyle w:val="Hyperlink"/>
@@ -150,7 +174,7 @@
               <w:rPr>
                 <w:noProof/>
               </w:rPr>
-              <w:instrText xml:space="preserve"> PAGEREF _Toc239726791 \h </w:instrText>
+              <w:instrText xml:space="preserve"> PAGEREF _Toc239876598 \h </w:instrText>
             </w:r>
             <w:r>
               <w:rPr>
@@ -192,7 +216,7 @@
               <w14:ligatures w14:val="standardContextual"/>
             </w:rPr>
           </w:pPr>
-          <w:hyperlink w:anchor="_Toc239726792" w:history="1">
+          <w:hyperlink w:anchor="_Toc239876599" w:history="1">
             <w:r>
               <w:rPr>
                 <w:rStyle w:val="Hyperlink"/>
@@ -217,7 +241,7 @@
               <w:rPr>
                 <w:noProof/>
               </w:rPr>
-              <w:instrText xml:space="preserve"> PAGEREF _Toc239726792 \h </w:instrText>
+              <w:instrText xml:space="preserve"> PAGEREF _Toc239876599 \h </w:instrText>
             </w:r>
             <w:r>
               <w:rPr>
@@ -259,7 +283,7 @@
               <w14:ligatures w14:val="standardContextual"/>
             </w:rPr>
           </w:pPr>
-          <w:hyperlink w:anchor="_Toc239726793" w:history="1">
+          <w:hyperlink w:anchor="_Toc239876600" w:history="1">
             <w:r>
               <w:rPr>
                 <w:rStyle w:val="Hyperlink"/>
@@ -283,7 +307,7 @@
               <w:rPr>
                 <w:noProof/>
               </w:rPr>
-              <w:instrText xml:space="preserve"> PAGEREF _Toc239726793 \h </w:instrText>
+              <w:instrText xml:space="preserve"> PAGEREF _Toc239876600 \h </w:instrText>
             </w:r>
             <w:r>
               <w:rPr>
@@ -325,7 +349,7 @@
               <w14:ligatures w14:val="standardContextual"/>
             </w:rPr>
           </w:pPr>
-          <w:hyperlink w:anchor="_Toc239726794" w:history="1">
+          <w:hyperlink w:anchor="_Toc239876601" w:history="1">
             <w:r>
               <w:rPr>
                 <w:rStyle w:val="Hyperlink"/>
@@ -350,7 +374,7 @@
               <w:rPr>
                 <w:noProof/>
               </w:rPr>
-              <w:instrText xml:space="preserve"> PAGEREF _Toc239726794 \h </w:instrText>
+              <w:instrText xml:space="preserve"> PAGEREF _Toc239876601 \h </w:instrText>
             </w:r>
             <w:r>
               <w:rPr>
@@ -392,7 +416,7 @@
               <w14:ligatures w14:val="standardContextual"/>
             </w:rPr>
           </w:pPr>
-          <w:hyperlink w:anchor="_Toc239726795" w:history="1">
+          <w:hyperlink w:anchor="_Toc239876602" w:history="1">
             <w:r>
               <w:rPr>
                 <w:rStyle w:val="Hyperlink"/>
@@ -417,7 +441,7 @@
               <w:rPr>
                 <w:noProof/>
               </w:rPr>
-              <w:instrText xml:space="preserve"> PAGEREF _Toc239726795 \h </w:instrText>
+              <w:instrText xml:space="preserve"> PAGEREF _Toc239876602 \h </w:instrText>
             </w:r>
             <w:r>
               <w:rPr>
@@ -459,7 +483,7 @@
               <w14:ligatures w14:val="standardContextual"/>
             </w:rPr>
           </w:pPr>
-          <w:hyperlink w:anchor="_Toc239726796" w:history="1">
+          <w:hyperlink w:anchor="_Toc239876603" w:history="1">
             <w:r>
               <w:rPr>
                 <w:rStyle w:val="Hyperlink"/>
@@ -484,7 +508,7 @@
               <w:rPr>
                 <w:noProof/>
               </w:rPr>
-              <w:instrText xml:space="preserve"> PAGEREF _Toc239726796 \h </w:instrText>
+              <w:instrText xml:space="preserve"> PAGEREF _Toc239876603 \h </w:instrText>
             </w:r>
             <w:r>
               <w:rPr>
@@ -526,7 +550,7 @@
               <w14:ligatures w14:val="standardContextual"/>
             </w:rPr>
           </w:pPr>
-          <w:hyperlink w:anchor="_Toc239726797" w:history="1">
+          <w:hyperlink w:anchor="_Toc239876604" w:history="1">
             <w:r>
               <w:rPr>
                 <w:rStyle w:val="Hyperlink"/>
@@ -551,7 +575,7 @@
               <w:rPr>
                 <w:noProof/>
               </w:rPr>
-              <w:instrText xml:space="preserve"> PAGEREF _Toc239726797 \h </w:instrText>
+              <w:instrText xml:space="preserve"> PAGEREF _Toc239876604 \h </w:instrText>
             </w:r>
             <w:r>
               <w:rPr>
@@ -593,7 +617,7 @@
               <w14:ligatures w14:val="standardContextual"/>
             </w:rPr>
           </w:pPr>
-          <w:hyperlink w:anchor="_Toc239726798" w:history="1">
+          <w:hyperlink w:anchor="_Toc239876605" w:history="1">
             <w:r>
               <w:rPr>
                 <w:rStyle w:val="Hyperlink"/>
@@ -618,7 +642,7 @@
               <w:rPr>
                 <w:noProof/>
               </w:rPr>
-              <w:instrText xml:space="preserve"> PAGEREF _Toc239726798 \h </w:instrText>
+              <w:instrText xml:space="preserve"> PAGEREF _Toc239876605 \h </w:instrText>
             </w:r>
             <w:r>
               <w:rPr>
@@ -660,7 +684,7 @@
               <w14:ligatures w14:val="standardContextual"/>
             </w:rPr>
           </w:pPr>
-          <w:hyperlink w:anchor="_Toc239726799" w:history="1">
+          <w:hyperlink w:anchor="_Toc239876606" w:history="1">
             <w:r>
               <w:rPr>
                 <w:rStyle w:val="Hyperlink"/>
@@ -685,7 +709,7 @@
               <w:rPr>
                 <w:noProof/>
               </w:rPr>
-              <w:instrText xml:space="preserve"> PAGEREF _Toc239726799 \h </w:instrText>
+              <w:instrText xml:space="preserve"> PAGEREF _Toc239876606 \h </w:instrText>
             </w:r>
             <w:r>
               <w:rPr>
@@ -727,7 +751,7 @@
               <w14:ligatures w14:val="standardContextual"/>
             </w:rPr>
           </w:pPr>
-          <w:hyperlink w:anchor="_Toc239726800" w:history="1">
+          <w:hyperlink w:anchor="_Toc239876607" w:history="1">
             <w:r>
               <w:rPr>
                 <w:rStyle w:val="Hyperlink"/>
@@ -751,7 +775,7 @@
               <w:rPr>
                 <w:noProof/>
               </w:rPr>
-              <w:instrText xml:space="preserve"> PAGEREF _Toc239726800 \h </w:instrText>
+              <w:instrText xml:space="preserve"> PAGEREF _Toc239876607 \h </w:instrText>
             </w:r>
             <w:r>
               <w:rPr>
@@ -793,7 +817,7 @@
               <w14:ligatures w14:val="standardContextual"/>
             </w:rPr>
           </w:pPr>
-          <w:hyperlink w:anchor="_Toc239726801" w:history="1">
+          <w:hyperlink w:anchor="_Toc239876608" w:history="1">
             <w:r>
               <w:rPr>
                 <w:rStyle w:val="Hyperlink"/>
@@ -817,7 +841,7 @@
               <w:rPr>
                 <w:noProof/>
               </w:rPr>
-              <w:instrText xml:space="preserve"> PAGEREF _Toc239726801 \h </w:instrText>
+              <w:instrText xml:space="preserve"> PAGEREF _Toc239876608 \h </w:instrText>
             </w:r>
             <w:r>
               <w:rPr>
@@ -859,7 +883,7 @@
               <w14:ligatures w14:val="standardContextual"/>
             </w:rPr>
           </w:pPr>
-          <w:hyperlink w:anchor="_Toc239726802" w:history="1">
+          <w:hyperlink w:anchor="_Toc239876609" w:history="1">
             <w:r>
               <w:rPr>
                 <w:rStyle w:val="Hyperlink"/>
@@ -883,7 +907,7 @@
               <w:rPr>
                 <w:noProof/>
               </w:rPr>
-              <w:instrText xml:space="preserve"> PAGEREF _Toc239726802 \h </w:instrText>
+              <w:instrText xml:space="preserve"> PAGEREF _Toc239876609 \h </w:instrText>
             </w:r>
             <w:r>
               <w:rPr>
@@ -925,7 +949,7 @@
               <w14:ligatures w14:val="standardContextual"/>
             </w:rPr>
           </w:pPr>
-          <w:hyperlink w:anchor="_Toc239726803" w:history="1">
+          <w:hyperlink w:anchor="_Toc239876610" w:history="1">
             <w:r>
               <w:rPr>
                 <w:rStyle w:val="Hyperlink"/>
@@ -949,7 +973,7 @@
               <w:rPr>
                 <w:noProof/>
               </w:rPr>
-              <w:instrText xml:space="preserve"> PAGEREF _Toc239726803 \h </w:instrText>
+              <w:instrText xml:space="preserve"> PAGEREF _Toc239876610 \h </w:instrText>
             </w:r>
             <w:r>
               <w:rPr>
@@ -991,7 +1015,7 @@
               <w14:ligatures w14:val="standardContextual"/>
             </w:rPr>
           </w:pPr>
-          <w:hyperlink w:anchor="_Toc239726804" w:history="1">
+          <w:hyperlink w:anchor="_Toc239876611" w:history="1">
             <w:r>
               <w:rPr>
                 <w:rStyle w:val="Hyperlink"/>
@@ -1015,7 +1039,7 @@
               <w:rPr>
                 <w:noProof/>
               </w:rPr>
-              <w:instrText xml:space="preserve"> PAGEREF _Toc239726804 \h </w:instrText>
+              <w:instrText xml:space="preserve"> PAGEREF _Toc239876611 \h </w:instrText>
             </w:r>
             <w:r>
               <w:rPr>
@@ -1057,7 +1081,7 @@
               <w14:ligatures w14:val="standardContextual"/>
             </w:rPr>
           </w:pPr>
-          <w:hyperlink w:anchor="_Toc239726805" w:history="1">
+          <w:hyperlink w:anchor="_Toc239876612" w:history="1">
             <w:r>
               <w:rPr>
                 <w:rStyle w:val="Hyperlink"/>
@@ -1082,7 +1106,7 @@
               <w:rPr>
                 <w:noProof/>
               </w:rPr>
-              <w:instrText xml:space="preserve"> PAGEREF _Toc239726805 \h </w:instrText>
+              <w:instrText xml:space="preserve"> PAGEREF _Toc239876612 \h </w:instrText>
             </w:r>
             <w:r>
               <w:rPr>
@@ -1124,7 +1148,7 @@
               <w14:ligatures w14:val="standardContextual"/>
             </w:rPr>
           </w:pPr>
-          <w:hyperlink w:anchor="_Toc239726806" w:history="1">
+          <w:hyperlink w:anchor="_Toc239876613" w:history="1">
             <w:r>
               <w:rPr>
                 <w:rStyle w:val="Hyperlink"/>
@@ -1149,7 +1173,7 @@
               <w:rPr>
                 <w:noProof/>
               </w:rPr>
-              <w:instrText xml:space="preserve"> PAGEREF _Toc239726806 \h </w:instrText>
+              <w:instrText xml:space="preserve"> PAGEREF _Toc239876613 \h </w:instrText>
             </w:r>
             <w:r>
               <w:rPr>
@@ -1191,7 +1215,7 @@
               <w14:ligatures w14:val="standardContextual"/>
             </w:rPr>
           </w:pPr>
-          <w:hyperlink w:anchor="_Toc239726807" w:history="1">
+          <w:hyperlink w:anchor="_Toc239876614" w:history="1">
             <w:r>
               <w:rPr>
                 <w:rStyle w:val="Hyperlink"/>
@@ -1215,7 +1239,7 @@
               <w:rPr>
                 <w:noProof/>
               </w:rPr>
-              <w:instrText xml:space="preserve"> PAGEREF _Toc239726807 \h </w:instrText>
+              <w:instrText xml:space="preserve"> PAGEREF _Toc239876614 \h </w:instrText>
             </w:r>
             <w:r>
               <w:rPr>
@@ -1257,7 +1281,7 @@
               <w14:ligatures w14:val="standardContextual"/>
             </w:rPr>
           </w:pPr>
-          <w:hyperlink w:anchor="_Toc239726808" w:history="1">
+          <w:hyperlink w:anchor="_Toc239876615" w:history="1">
             <w:r>
               <w:rPr>
                 <w:rStyle w:val="Hyperlink"/>
@@ -1281,7 +1305,7 @@
               <w:rPr>
                 <w:noProof/>
               </w:rPr>
-              <w:instrText xml:space="preserve"> PAGEREF _Toc239726808 \h </w:instrText>
+              <w:instrText xml:space="preserve"> PAGEREF _Toc239876615 \h </w:instrText>
             </w:r>
             <w:r>
               <w:rPr>
@@ -1323,7 +1347,7 @@
               <w14:ligatures w14:val="standardContextual"/>
             </w:rPr>
           </w:pPr>
-          <w:hyperlink w:anchor="_Toc239726809" w:history="1">
+          <w:hyperlink w:anchor="_Toc239876616" w:history="1">
             <w:r>
               <w:rPr>
                 <w:rStyle w:val="Hyperlink"/>
@@ -1348,7 +1372,7 @@
               <w:rPr>
                 <w:noProof/>
               </w:rPr>
-              <w:instrText xml:space="preserve"> PAGEREF _Toc239726809 \h </w:instrText>
+              <w:instrText xml:space="preserve"> PAGEREF _Toc239876616 \h </w:instrText>
             </w:r>
             <w:r>
               <w:rPr>
@@ -1365,7 +1389,7 @@
               <w:rPr>
                 <w:noProof/>
               </w:rPr>
-              <w:t>10</w:t>
+              <w:t>11</w:t>
             </w:r>
             <w:r>
               <w:rPr>
@@ -1390,7 +1414,7 @@
               <w14:ligatures w14:val="standardContextual"/>
             </w:rPr>
           </w:pPr>
-          <w:hyperlink w:anchor="_Toc239726810" w:history="1">
+          <w:hyperlink w:anchor="_Toc239876617" w:history="1">
             <w:r>
               <w:rPr>
                 <w:rStyle w:val="Hyperlink"/>
@@ -1415,7 +1439,7 @@
               <w:rPr>
                 <w:noProof/>
               </w:rPr>
-              <w:instrText xml:space="preserve"> PAGEREF _Toc239726810 \h </w:instrText>
+              <w:instrText xml:space="preserve"> PAGEREF _Toc239876617 \h </w:instrText>
             </w:r>
             <w:r>
               <w:rPr>
@@ -1457,7 +1481,7 @@
               <w14:ligatures w14:val="standardContextual"/>
             </w:rPr>
           </w:pPr>
-          <w:hyperlink w:anchor="_Toc239726811" w:history="1">
+          <w:hyperlink w:anchor="_Toc239876618" w:history="1">
             <w:r>
               <w:rPr>
                 <w:rStyle w:val="Hyperlink"/>
@@ -1482,7 +1506,7 @@
               <w:rPr>
                 <w:noProof/>
               </w:rPr>
-              <w:instrText xml:space="preserve"> PAGEREF _Toc239726811 \h </w:instrText>
+              <w:instrText xml:space="preserve"> PAGEREF _Toc239876618 \h </w:instrText>
             </w:r>
             <w:r>
               <w:rPr>
@@ -1524,7 +1548,7 @@
               <w14:ligatures w14:val="standardContextual"/>
             </w:rPr>
           </w:pPr>
-          <w:hyperlink w:anchor="_Toc239726812" w:history="1">
+          <w:hyperlink w:anchor="_Toc239876619" w:history="1">
             <w:r>
               <w:rPr>
                 <w:rStyle w:val="Hyperlink"/>
@@ -1549,7 +1573,7 @@
               <w:rPr>
                 <w:noProof/>
               </w:rPr>
-              <w:instrText xml:space="preserve"> PAGEREF _Toc239726812 \h </w:instrText>
+              <w:instrText xml:space="preserve"> PAGEREF _Toc239876619 \h </w:instrText>
             </w:r>
             <w:r>
               <w:rPr>
@@ -1591,7 +1615,7 @@
               <w14:ligatures w14:val="standardContextual"/>
             </w:rPr>
           </w:pPr>
-          <w:hyperlink w:anchor="_Toc239726813" w:history="1">
+          <w:hyperlink w:anchor="_Toc239876620" w:history="1">
             <w:r>
               <w:rPr>
                 <w:rStyle w:val="Hyperlink"/>
@@ -1616,7 +1640,7 @@
               <w:rPr>
                 <w:noProof/>
               </w:rPr>
-              <w:instrText xml:space="preserve"> PAGEREF _Toc239726813 \h </w:instrText>
+              <w:instrText xml:space="preserve"> PAGEREF _Toc239876620 \h </w:instrText>
             </w:r>
             <w:r>
               <w:rPr>
@@ -1658,7 +1682,7 @@
               <w14:ligatures w14:val="standardContextual"/>
             </w:rPr>
           </w:pPr>
-          <w:hyperlink w:anchor="_Toc239726814" w:history="1">
+          <w:hyperlink w:anchor="_Toc239876621" w:history="1">
             <w:r>
               <w:rPr>
                 <w:rStyle w:val="Hyperlink"/>
@@ -1683,7 +1707,7 @@
               <w:rPr>
                 <w:noProof/>
               </w:rPr>
-              <w:instrText xml:space="preserve"> PAGEREF _Toc239726814 \h </w:instrText>
+              <w:instrText xml:space="preserve"> PAGEREF _Toc239876621 \h </w:instrText>
             </w:r>
             <w:r>
               <w:rPr>
@@ -1725,7 +1749,7 @@
               <w14:ligatures w14:val="standardContextual"/>
             </w:rPr>
           </w:pPr>
-          <w:hyperlink w:anchor="_Toc239726815" w:history="1">
+          <w:hyperlink w:anchor="_Toc239876622" w:history="1">
             <w:r>
               <w:rPr>
                 <w:rStyle w:val="Hyperlink"/>
@@ -1750,7 +1774,7 @@
               <w:rPr>
                 <w:noProof/>
               </w:rPr>
-              <w:instrText xml:space="preserve"> PAGEREF _Toc239726815 \h </w:instrText>
+              <w:instrText xml:space="preserve"> PAGEREF _Toc239876622 \h </w:instrText>
             </w:r>
             <w:r>
               <w:rPr>
@@ -1767,7 +1791,7 @@
               <w:rPr>
                 <w:noProof/>
               </w:rPr>
-              <w:t>11</w:t>
+              <w:t>12</w:t>
             </w:r>
             <w:r>
               <w:rPr>
@@ -1792,7 +1816,7 @@
               <w14:ligatures w14:val="standardContextual"/>
             </w:rPr>
           </w:pPr>
-          <w:hyperlink w:anchor="_Toc239726816" w:history="1">
+          <w:hyperlink w:anchor="_Toc239876623" w:history="1">
             <w:r>
               <w:rPr>
                 <w:rStyle w:val="Hyperlink"/>
@@ -1817,7 +1841,7 @@
               <w:rPr>
                 <w:noProof/>
               </w:rPr>
-              <w:instrText xml:space="preserve"> PAGEREF _Toc239726816 \h </w:instrText>
+              <w:instrText xml:space="preserve"> PAGEREF _Toc239876623 \h </w:instrText>
             </w:r>
             <w:r>
               <w:rPr>
@@ -1859,7 +1883,7 @@
               <w14:ligatures w14:val="standardContextual"/>
             </w:rPr>
           </w:pPr>
-          <w:hyperlink w:anchor="_Toc239726817" w:history="1">
+          <w:hyperlink w:anchor="_Toc239876624" w:history="1">
             <w:r>
               <w:rPr>
                 <w:rStyle w:val="Hyperlink"/>
@@ -1883,7 +1907,7 @@
               <w:rPr>
                 <w:noProof/>
               </w:rPr>
-              <w:instrText xml:space="preserve"> PAGEREF _Toc239726817 \h </w:instrText>
+              <w:instrText xml:space="preserve"> PAGEREF _Toc239876624 \h </w:instrText>
             </w:r>
             <w:r>
               <w:rPr>
@@ -1925,7 +1949,7 @@
               <w14:ligatures w14:val="standardContextual"/>
             </w:rPr>
           </w:pPr>
-          <w:hyperlink w:anchor="_Toc239726818" w:history="1">
+          <w:hyperlink w:anchor="_Toc239876625" w:history="1">
             <w:r>
               <w:rPr>
                 <w:rStyle w:val="Hyperlink"/>
@@ -1949,7 +1973,7 @@
               <w:rPr>
                 <w:noProof/>
               </w:rPr>
-              <w:instrText xml:space="preserve"> PAGEREF _Toc239726818 \h </w:instrText>
+              <w:instrText xml:space="preserve"> PAGEREF _Toc239876625 \h </w:instrText>
             </w:r>
             <w:r>
               <w:rPr>
@@ -1991,7 +2015,7 @@
               <w14:ligatures w14:val="standardContextual"/>
             </w:rPr>
           </w:pPr>
-          <w:hyperlink w:anchor="_Toc239726819" w:history="1">
+          <w:hyperlink w:anchor="_Toc239876626" w:history="1">
             <w:r>
               <w:rPr>
                 <w:rStyle w:val="Hyperlink"/>
@@ -2015,7 +2039,7 @@
               <w:rPr>
                 <w:noProof/>
               </w:rPr>
-              <w:instrText xml:space="preserve"> PAGEREF _Toc239726819 \h </w:instrText>
+              <w:instrText xml:space="preserve"> PAGEREF _Toc239876626 \h </w:instrText>
             </w:r>
             <w:r>
               <w:rPr>
@@ -2057,7 +2081,7 @@
               <w14:ligatures w14:val="standardContextual"/>
             </w:rPr>
           </w:pPr>
-          <w:hyperlink w:anchor="_Toc239726820" w:history="1">
+          <w:hyperlink w:anchor="_Toc239876627" w:history="1">
             <w:r>
               <w:rPr>
                 <w:rStyle w:val="Hyperlink"/>
@@ -2081,7 +2105,7 @@
               <w:rPr>
                 <w:noProof/>
               </w:rPr>
-              <w:instrText xml:space="preserve"> PAGEREF _Toc239726820 \h </w:instrText>
+              <w:instrText xml:space="preserve"> PAGEREF _Toc239876627 \h </w:instrText>
             </w:r>
             <w:r>
               <w:rPr>
@@ -2098,7 +2122,7 @@
               <w:rPr>
                 <w:noProof/>
               </w:rPr>
-              <w:t>13</w:t>
+              <w:t>14</w:t>
             </w:r>
             <w:r>
               <w:rPr>
@@ -2123,7 +2147,7 @@
               <w14:ligatures w14:val="standardContextual"/>
             </w:rPr>
           </w:pPr>
-          <w:hyperlink w:anchor="_Toc239726821" w:history="1">
+          <w:hyperlink w:anchor="_Toc239876628" w:history="1">
             <w:r>
               <w:rPr>
                 <w:rStyle w:val="Hyperlink"/>
@@ -2148,7 +2172,7 @@
               <w:rPr>
                 <w:noProof/>
               </w:rPr>
-              <w:instrText xml:space="preserve"> PAGEREF _Toc239726821 \h </w:instrText>
+              <w:instrText xml:space="preserve"> PAGEREF _Toc239876628 \h </w:instrText>
             </w:r>
             <w:r>
               <w:rPr>
@@ -2190,7 +2214,7 @@
               <w14:ligatures w14:val="standardContextual"/>
             </w:rPr>
           </w:pPr>
-          <w:hyperlink w:anchor="_Toc239726822" w:history="1">
+          <w:hyperlink w:anchor="_Toc239876629" w:history="1">
             <w:r>
               <w:rPr>
                 <w:rStyle w:val="Hyperlink"/>
@@ -2215,7 +2239,7 @@
               <w:rPr>
                 <w:noProof/>
               </w:rPr>
-              <w:instrText xml:space="preserve"> PAGEREF _Toc239726822 \h </w:instrText>
+              <w:instrText xml:space="preserve"> PAGEREF _Toc239876629 \h </w:instrText>
             </w:r>
             <w:r>
               <w:rPr>
@@ -2257,7 +2281,7 @@
               <w14:ligatures w14:val="standardContextual"/>
             </w:rPr>
           </w:pPr>
-          <w:hyperlink w:anchor="_Toc239726823" w:history="1">
+          <w:hyperlink w:anchor="_Toc239876630" w:history="1">
             <w:r>
               <w:rPr>
                 <w:rStyle w:val="Hyperlink"/>
@@ -2282,7 +2306,7 @@
               <w:rPr>
                 <w:noProof/>
               </w:rPr>
-              <w:instrText xml:space="preserve"> PAGEREF _Toc239726823 \h </w:instrText>
+              <w:instrText xml:space="preserve"> PAGEREF _Toc239876630 \h </w:instrText>
             </w:r>
             <w:r>
               <w:rPr>
@@ -2324,7 +2348,7 @@
               <w14:ligatures w14:val="standardContextual"/>
             </w:rPr>
           </w:pPr>
-          <w:hyperlink w:anchor="_Toc239726824" w:history="1">
+          <w:hyperlink w:anchor="_Toc239876631" w:history="1">
             <w:r>
               <w:rPr>
                 <w:rStyle w:val="Hyperlink"/>
@@ -2349,7 +2373,7 @@
               <w:rPr>
                 <w:noProof/>
               </w:rPr>
-              <w:instrText xml:space="preserve"> PAGEREF _Toc239726824 \h </w:instrText>
+              <w:instrText xml:space="preserve"> PAGEREF _Toc239876631 \h </w:instrText>
             </w:r>
             <w:r>
               <w:rPr>
@@ -2391,7 +2415,7 @@
               <w14:ligatures w14:val="standardContextual"/>
             </w:rPr>
           </w:pPr>
-          <w:hyperlink w:anchor="_Toc239726825" w:history="1">
+          <w:hyperlink w:anchor="_Toc239876632" w:history="1">
             <w:r>
               <w:rPr>
                 <w:rStyle w:val="Hyperlink"/>
@@ -2416,7 +2440,7 @@
               <w:rPr>
                 <w:noProof/>
               </w:rPr>
-              <w:instrText xml:space="preserve"> PAGEREF _Toc239726825 \h </w:instrText>
+              <w:instrText xml:space="preserve"> PAGEREF _Toc239876632 \h </w:instrText>
             </w:r>
             <w:r>
               <w:rPr>
@@ -2458,7 +2482,7 @@
               <w14:ligatures w14:val="standardContextual"/>
             </w:rPr>
           </w:pPr>
-          <w:hyperlink w:anchor="_Toc239726826" w:history="1">
+          <w:hyperlink w:anchor="_Toc239876633" w:history="1">
             <w:r>
               <w:rPr>
                 <w:rStyle w:val="Hyperlink"/>
@@ -2483,7 +2507,7 @@
               <w:rPr>
                 <w:noProof/>
               </w:rPr>
-              <w:instrText xml:space="preserve"> PAGEREF _Toc239726826 \h </w:instrText>
+              <w:instrText xml:space="preserve"> PAGEREF _Toc239876633 \h </w:instrText>
             </w:r>
             <w:r>
               <w:rPr>
@@ -2500,7 +2524,7 @@
               <w:rPr>
                 <w:noProof/>
               </w:rPr>
-              <w:t>14</w:t>
+              <w:t>15</w:t>
             </w:r>
             <w:r>
               <w:rPr>
@@ -2525,7 +2549,7 @@
               <w14:ligatures w14:val="standardContextual"/>
             </w:rPr>
           </w:pPr>
-          <w:hyperlink w:anchor="_Toc239726827" w:history="1">
+          <w:hyperlink w:anchor="_Toc239876634" w:history="1">
             <w:r>
               <w:rPr>
                 <w:rStyle w:val="Hyperlink"/>
@@ -2549,7 +2573,7 @@
               <w:rPr>
                 <w:noProof/>
               </w:rPr>
-              <w:instrText xml:space="preserve"> PAGEREF _Toc239726827 \h </w:instrText>
+              <w:instrText xml:space="preserve"> PAGEREF _Toc239876634 \h </w:instrText>
             </w:r>
             <w:r>
               <w:rPr>
@@ -2566,7 +2590,7 @@
               <w:rPr>
                 <w:noProof/>
               </w:rPr>
-              <w:t>14</w:t>
+              <w:t>15</w:t>
             </w:r>
             <w:r>
               <w:rPr>
@@ -2591,7 +2615,7 @@
               <w14:ligatures w14:val="standardContextual"/>
             </w:rPr>
           </w:pPr>
-          <w:hyperlink w:anchor="_Toc239726828" w:history="1">
+          <w:hyperlink w:anchor="_Toc239876635" w:history="1">
             <w:r>
               <w:rPr>
                 <w:rStyle w:val="Hyperlink"/>
@@ -2616,7 +2640,7 @@
               <w:rPr>
                 <w:noProof/>
               </w:rPr>
-              <w:instrText xml:space="preserve"> PAGEREF _Toc239726828 \h </w:instrText>
+              <w:instrText xml:space="preserve"> PAGEREF _Toc239876635 \h </w:instrText>
             </w:r>
             <w:r>
               <w:rPr>
@@ -2658,7 +2682,7 @@
               <w14:ligatures w14:val="standardContextual"/>
             </w:rPr>
           </w:pPr>
-          <w:hyperlink w:anchor="_Toc239726829" w:history="1">
+          <w:hyperlink w:anchor="_Toc239876636" w:history="1">
             <w:r>
               <w:rPr>
                 <w:rStyle w:val="Hyperlink"/>
@@ -2683,7 +2707,7 @@
               <w:rPr>
                 <w:noProof/>
               </w:rPr>
-              <w:instrText xml:space="preserve"> PAGEREF _Toc239726829 \h </w:instrText>
+              <w:instrText xml:space="preserve"> PAGEREF _Toc239876636 \h </w:instrText>
             </w:r>
             <w:r>
               <w:rPr>
@@ -2725,7 +2749,7 @@
               <w14:ligatures w14:val="standardContextual"/>
             </w:rPr>
           </w:pPr>
-          <w:hyperlink w:anchor="_Toc239726830" w:history="1">
+          <w:hyperlink w:anchor="_Toc239876637" w:history="1">
             <w:r>
               <w:rPr>
                 <w:rStyle w:val="Hyperlink"/>
@@ -2750,7 +2774,7 @@
               <w:rPr>
                 <w:noProof/>
               </w:rPr>
-              <w:instrText xml:space="preserve"> PAGEREF _Toc239726830 \h </w:instrText>
+              <w:instrText xml:space="preserve"> PAGEREF _Toc239876637 \h </w:instrText>
             </w:r>
             <w:r>
               <w:rPr>
@@ -2767,7 +2791,7 @@
               <w:rPr>
                 <w:noProof/>
               </w:rPr>
-              <w:t>15</w:t>
+              <w:t>16</w:t>
             </w:r>
             <w:r>
               <w:rPr>
@@ -2792,7 +2816,7 @@
               <w14:ligatures w14:val="standardContextual"/>
             </w:rPr>
           </w:pPr>
-          <w:hyperlink w:anchor="_Toc239726831" w:history="1">
+          <w:hyperlink w:anchor="_Toc239876638" w:history="1">
             <w:r>
               <w:rPr>
                 <w:rStyle w:val="Hyperlink"/>
@@ -2817,7 +2841,7 @@
               <w:rPr>
                 <w:noProof/>
               </w:rPr>
-              <w:instrText xml:space="preserve"> PAGEREF _Toc239726831 \h </w:instrText>
+              <w:instrText xml:space="preserve"> PAGEREF _Toc239876638 \h </w:instrText>
             </w:r>
             <w:r>
               <w:rPr>
@@ -2859,7 +2883,7 @@
               <w14:ligatures w14:val="standardContextual"/>
             </w:rPr>
           </w:pPr>
-          <w:hyperlink w:anchor="_Toc239726832" w:history="1">
+          <w:hyperlink w:anchor="_Toc239876639" w:history="1">
             <w:r>
               <w:rPr>
                 <w:rStyle w:val="Hyperlink"/>
@@ -2884,7 +2908,7 @@
               <w:rPr>
                 <w:noProof/>
               </w:rPr>
-              <w:instrText xml:space="preserve"> PAGEREF _Toc239726832 \h </w:instrText>
+              <w:instrText xml:space="preserve"> PAGEREF _Toc239876639 \h </w:instrText>
             </w:r>
             <w:r>
               <w:rPr>
@@ -2926,7 +2950,7 @@
               <w14:ligatures w14:val="standardContextual"/>
             </w:rPr>
           </w:pPr>
-          <w:hyperlink w:anchor="_Toc239726833" w:history="1">
+          <w:hyperlink w:anchor="_Toc239876640" w:history="1">
             <w:r>
               <w:rPr>
                 <w:rStyle w:val="Hyperlink"/>
@@ -2951,7 +2975,7 @@
               <w:rPr>
                 <w:noProof/>
               </w:rPr>
-              <w:instrText xml:space="preserve"> PAGEREF _Toc239726833 \h </w:instrText>
+              <w:instrText xml:space="preserve"> PAGEREF _Toc239876640 \h </w:instrText>
             </w:r>
             <w:r>
               <w:rPr>
@@ -2993,7 +3017,7 @@
               <w14:ligatures w14:val="standardContextual"/>
             </w:rPr>
           </w:pPr>
-          <w:hyperlink w:anchor="_Toc239726834" w:history="1">
+          <w:hyperlink w:anchor="_Toc239876641" w:history="1">
             <w:r>
               <w:rPr>
                 <w:rStyle w:val="Hyperlink"/>
@@ -3018,7 +3042,7 @@
               <w:rPr>
                 <w:noProof/>
               </w:rPr>
-              <w:instrText xml:space="preserve"> PAGEREF _Toc239726834 \h </w:instrText>
+              <w:instrText xml:space="preserve"> PAGEREF _Toc239876641 \h </w:instrText>
             </w:r>
             <w:r>
               <w:rPr>
@@ -3060,7 +3084,7 @@
               <w14:ligatures w14:val="standardContextual"/>
             </w:rPr>
           </w:pPr>
-          <w:hyperlink w:anchor="_Toc239726835" w:history="1">
+          <w:hyperlink w:anchor="_Toc239876642" w:history="1">
             <w:r>
               <w:rPr>
                 <w:rStyle w:val="Hyperlink"/>
@@ -3085,7 +3109,7 @@
               <w:rPr>
                 <w:noProof/>
               </w:rPr>
-              <w:instrText xml:space="preserve"> PAGEREF _Toc239726835 \h </w:instrText>
+              <w:instrText xml:space="preserve"> PAGEREF _Toc239876642 \h </w:instrText>
             </w:r>
             <w:r>
               <w:rPr>
@@ -3102,7 +3126,7 @@
               <w:rPr>
                 <w:noProof/>
               </w:rPr>
-              <w:t>16</w:t>
+              <w:t>17</w:t>
             </w:r>
             <w:r>
               <w:rPr>
@@ -3127,7 +3151,7 @@
               <w14:ligatures w14:val="standardContextual"/>
             </w:rPr>
           </w:pPr>
-          <w:hyperlink w:anchor="_Toc239726836" w:history="1">
+          <w:hyperlink w:anchor="_Toc239876643" w:history="1">
             <w:r>
               <w:rPr>
                 <w:rStyle w:val="Hyperlink"/>
@@ -3152,7 +3176,7 @@
               <w:rPr>
                 <w:noProof/>
               </w:rPr>
-              <w:instrText xml:space="preserve"> PAGEREF _Toc239726836 \h </w:instrText>
+              <w:instrText xml:space="preserve"> PAGEREF _Toc239876643 \h </w:instrText>
             </w:r>
             <w:r>
               <w:rPr>
@@ -3169,7 +3193,7 @@
               <w:rPr>
                 <w:noProof/>
               </w:rPr>
-              <w:t>16</w:t>
+              <w:t>17</w:t>
             </w:r>
             <w:r>
               <w:rPr>
@@ -3194,7 +3218,7 @@
               <w14:ligatures w14:val="standardContextual"/>
             </w:rPr>
           </w:pPr>
-          <w:hyperlink w:anchor="_Toc239726837" w:history="1">
+          <w:hyperlink w:anchor="_Toc239876644" w:history="1">
             <w:r>
               <w:rPr>
                 <w:rStyle w:val="Hyperlink"/>
@@ -3219,7 +3243,7 @@
               <w:rPr>
                 <w:noProof/>
               </w:rPr>
-              <w:instrText xml:space="preserve"> PAGEREF _Toc239726837 \h </w:instrText>
+              <w:instrText xml:space="preserve"> PAGEREF _Toc239876644 \h </w:instrText>
             </w:r>
             <w:r>
               <w:rPr>
@@ -3261,7 +3285,7 @@
               <w14:ligatures w14:val="standardContextual"/>
             </w:rPr>
           </w:pPr>
-          <w:hyperlink w:anchor="_Toc239726838" w:history="1">
+          <w:hyperlink w:anchor="_Toc239876645" w:history="1">
             <w:r>
               <w:rPr>
                 <w:rStyle w:val="Hyperlink"/>
@@ -3286,7 +3310,7 @@
               <w:rPr>
                 <w:noProof/>
               </w:rPr>
-              <w:instrText xml:space="preserve"> PAGEREF _Toc239726838 \h </w:instrText>
+              <w:instrText xml:space="preserve"> PAGEREF _Toc239876645 \h </w:instrText>
             </w:r>
             <w:r>
               <w:rPr>
@@ -3328,7 +3352,7 @@
               <w14:ligatures w14:val="standardContextual"/>
             </w:rPr>
           </w:pPr>
-          <w:hyperlink w:anchor="_Toc239726839" w:history="1">
+          <w:hyperlink w:anchor="_Toc239876646" w:history="1">
             <w:r>
               <w:rPr>
                 <w:rStyle w:val="Hyperlink"/>
@@ -3352,7 +3376,7 @@
               <w:rPr>
                 <w:noProof/>
               </w:rPr>
-              <w:instrText xml:space="preserve"> PAGEREF _Toc239726839 \h </w:instrText>
+              <w:instrText xml:space="preserve"> PAGEREF _Toc239876646 \h </w:instrText>
             </w:r>
             <w:r>
               <w:rPr>
@@ -3369,7 +3393,7 @@
               <w:rPr>
                 <w:noProof/>
               </w:rPr>
-              <w:t>17</w:t>
+              <w:t>18</w:t>
             </w:r>
             <w:r>
               <w:rPr>
@@ -3394,7 +3418,7 @@
               <w14:ligatures w14:val="standardContextual"/>
             </w:rPr>
           </w:pPr>
-          <w:hyperlink w:anchor="_Toc239726840" w:history="1">
+          <w:hyperlink w:anchor="_Toc239876647" w:history="1">
             <w:r>
               <w:rPr>
                 <w:rStyle w:val="Hyperlink"/>
@@ -3419,7 +3443,7 @@
               <w:rPr>
                 <w:noProof/>
               </w:rPr>
-              <w:instrText xml:space="preserve"> PAGEREF _Toc239726840 \h </w:instrText>
+              <w:instrText xml:space="preserve"> PAGEREF _Toc239876647 \h </w:instrText>
             </w:r>
             <w:r>
               <w:rPr>
@@ -3466,7 +3490,7 @@
           <w:lang w:val="es-BO"/>
         </w:rPr>
       </w:pPr>
-      <w:bookmarkStart w:id="1" w:name="_Toc239726792"/>
+      <w:bookmarkStart w:id="1" w:name="_Toc239876599"/>
       <w:r>
         <w:rPr>
           <w:lang w:val="es-BO"/>
@@ -3539,7 +3563,7 @@
         <w:pStyle w:val="Heading1"/>
         <w:spacing w:before="360" w:after="180"/>
       </w:pPr>
-      <w:bookmarkStart w:id="2" w:name="_Toc239726793"/>
+      <w:bookmarkStart w:id="2" w:name="_Toc239876600"/>
       <w:r>
         <w:t xml:space="preserve">2. Stack </w:t>
       </w:r>
@@ -4519,7 +4543,7 @@
           <w:lang w:val="es-BO"/>
         </w:rPr>
       </w:pPr>
-      <w:bookmarkStart w:id="3" w:name="_Toc239726794"/>
+      <w:bookmarkStart w:id="3" w:name="_Toc239876601"/>
       <w:r>
         <w:rPr>
           <w:lang w:val="es-BO"/>
@@ -4896,7 +4920,7 @@
           <w:lang w:val="es-BO"/>
         </w:rPr>
       </w:pPr>
-      <w:bookmarkStart w:id="4" w:name="_Toc239726795"/>
+      <w:bookmarkStart w:id="4" w:name="_Toc239876602"/>
       <w:r>
         <w:rPr>
           <w:lang w:val="es-BO"/>
@@ -5387,6 +5411,15 @@
           <w:lang w:val="es-BO"/>
         </w:rPr>
       </w:pPr>
+    </w:p>
+    <w:p>
+      <w:pPr>
+        <w:spacing w:after="140" w:line="300" w:lineRule="auto"/>
+        <w:jc w:val="both"/>
+        <w:rPr>
+          <w:lang w:val="es-BO"/>
+        </w:rPr>
+      </w:pPr>
       <w:r>
         <w:rPr>
           <w:lang w:val="es-BO"/>
@@ -5851,7 +5884,7 @@
           <w:lang w:val="es-BO"/>
         </w:rPr>
       </w:pPr>
-      <w:bookmarkStart w:id="5" w:name="_Toc239726796"/>
+      <w:bookmarkStart w:id="5" w:name="_Toc239876603"/>
       <w:r>
         <w:rPr>
           <w:lang w:val="es-BO"/>
@@ -6687,6 +6720,7 @@
           <w:szCs w:val="16"/>
           <w:lang w:val="es-BO"/>
         </w:rPr>
+        <w:lastRenderedPageBreak/>
         <w:t xml:space="preserve">│   ├── </w:t>
       </w:r>
       <w:proofErr w:type="spellStart"/>
@@ -6760,7 +6794,6 @@
           <w:sz w:val="16"/>
           <w:szCs w:val="16"/>
         </w:rPr>
-        <w:lastRenderedPageBreak/>
         <w:t>│   │   ├── approverService.js</w:t>
       </w:r>
     </w:p>
@@ -7373,7 +7406,7 @@
           <w:lang w:val="es-BO"/>
         </w:rPr>
       </w:pPr>
-      <w:bookmarkStart w:id="6" w:name="_Toc239726797"/>
+      <w:bookmarkStart w:id="6" w:name="_Toc239876604"/>
       <w:r>
         <w:rPr>
           <w:lang w:val="es-BO"/>
@@ -8497,7 +8530,7 @@
           <w:lang w:val="es-BO"/>
         </w:rPr>
       </w:pPr>
-      <w:bookmarkStart w:id="7" w:name="_Toc239726798"/>
+      <w:bookmarkStart w:id="7" w:name="_Toc239876605"/>
       <w:r>
         <w:rPr>
           <w:lang w:val="es-BO"/>
@@ -8608,6 +8641,7 @@
                 <w:sz w:val="19"/>
                 <w:szCs w:val="19"/>
               </w:rPr>
+              <w:lastRenderedPageBreak/>
               <w:t>Dominio</w:t>
             </w:r>
           </w:p>
@@ -8710,7 +8744,6 @@
                 <w:sz w:val="19"/>
                 <w:szCs w:val="19"/>
               </w:rPr>
-              <w:lastRenderedPageBreak/>
               <w:t>trip</w:t>
             </w:r>
           </w:p>
@@ -8961,7 +8994,7 @@
           <w:lang w:val="es-BO"/>
         </w:rPr>
       </w:pPr>
-      <w:bookmarkStart w:id="8" w:name="_Toc239726799"/>
+      <w:bookmarkStart w:id="8" w:name="_Toc239876606"/>
       <w:r>
         <w:rPr>
           <w:lang w:val="es-BO"/>
@@ -10784,7 +10817,7 @@
         <w:pStyle w:val="Heading2"/>
         <w:spacing w:before="280" w:after="140"/>
       </w:pPr>
-      <w:bookmarkStart w:id="9" w:name="_Toc239726800"/>
+      <w:bookmarkStart w:id="9" w:name="_Toc239876607"/>
       <w:r>
         <w:t xml:space="preserve">5.1 </w:t>
       </w:r>
@@ -10820,6 +10853,7 @@
         <w:rPr>
           <w:lang w:val="es-BO"/>
         </w:rPr>
+        <w:lastRenderedPageBreak/>
         <w:t xml:space="preserve">El archivo review.js concentra los dos flujos del supervisor, diferenciados por el segmento inicial de la ruta: </w:t>
       </w:r>
       <w:proofErr w:type="spellStart"/>
@@ -10932,7 +10966,6 @@
                 <w:sz w:val="19"/>
                 <w:szCs w:val="19"/>
               </w:rPr>
-              <w:lastRenderedPageBreak/>
               <w:t>Método</w:t>
             </w:r>
             <w:proofErr w:type="spellEnd"/>
@@ -12864,6 +12897,15 @@
           <w:lang w:val="es-BO"/>
         </w:rPr>
       </w:pPr>
+    </w:p>
+    <w:p>
+      <w:pPr>
+        <w:spacing w:after="140" w:line="300" w:lineRule="auto"/>
+        <w:jc w:val="both"/>
+        <w:rPr>
+          <w:lang w:val="es-BO"/>
+        </w:rPr>
+      </w:pPr>
       <w:r>
         <w:rPr>
           <w:lang w:val="es-BO"/>
@@ -12876,7 +12918,7 @@
         <w:pStyle w:val="Heading2"/>
         <w:spacing w:before="280" w:after="140"/>
       </w:pPr>
-      <w:bookmarkStart w:id="10" w:name="_Toc239726801"/>
+      <w:bookmarkStart w:id="10" w:name="_Toc239876608"/>
       <w:r>
         <w:t xml:space="preserve">5.2 </w:t>
       </w:r>
@@ -13451,6 +13493,7 @@
                 <w:sz w:val="19"/>
                 <w:szCs w:val="19"/>
               </w:rPr>
+              <w:lastRenderedPageBreak/>
               <w:t>POST /reviewer</w:t>
             </w:r>
             <w:proofErr w:type="gramStart"/>
@@ -13767,9 +13810,8 @@
         <w:pStyle w:val="Heading2"/>
         <w:spacing w:before="280" w:after="140"/>
       </w:pPr>
-      <w:bookmarkStart w:id="11" w:name="_Toc239726802"/>
-      <w:r>
-        <w:lastRenderedPageBreak/>
+      <w:bookmarkStart w:id="11" w:name="_Toc239876609"/>
+      <w:r>
         <w:t xml:space="preserve">5.3 </w:t>
       </w:r>
       <w:proofErr w:type="spellStart"/>
@@ -14465,7 +14507,7 @@
         <w:pStyle w:val="Heading2"/>
         <w:spacing w:before="280" w:after="140"/>
       </w:pPr>
-      <w:bookmarkStart w:id="12" w:name="_Toc239726803"/>
+      <w:bookmarkStart w:id="12" w:name="_Toc239876610"/>
       <w:r>
         <w:t xml:space="preserve">5.4 </w:t>
       </w:r>
@@ -15234,6 +15276,15 @@
           <w:lang w:val="es-BO"/>
         </w:rPr>
       </w:pPr>
+    </w:p>
+    <w:p>
+      <w:pPr>
+        <w:spacing w:after="140" w:line="300" w:lineRule="auto"/>
+        <w:jc w:val="both"/>
+        <w:rPr>
+          <w:lang w:val="es-BO"/>
+        </w:rPr>
+      </w:pPr>
       <w:r>
         <w:rPr>
           <w:lang w:val="es-BO"/>
@@ -15246,7 +15297,7 @@
         <w:pStyle w:val="Heading1"/>
         <w:spacing w:before="360" w:after="180"/>
       </w:pPr>
-      <w:bookmarkStart w:id="13" w:name="_Toc239726804"/>
+      <w:bookmarkStart w:id="13" w:name="_Toc239876611"/>
       <w:r>
         <w:t xml:space="preserve">6. </w:t>
       </w:r>
@@ -15459,6 +15510,7 @@
                 <w:sz w:val="19"/>
                 <w:szCs w:val="19"/>
               </w:rPr>
+              <w:lastRenderedPageBreak/>
               <w:t>loginRateLimiter</w:t>
             </w:r>
             <w:proofErr w:type="spellEnd"/>
@@ -15548,6 +15600,15 @@
         </w:tc>
       </w:tr>
     </w:tbl>
+    <w:p>
+      <w:pPr>
+        <w:spacing w:after="140" w:line="300" w:lineRule="auto"/>
+        <w:jc w:val="both"/>
+        <w:rPr>
+          <w:lang w:val="es-BO"/>
+        </w:rPr>
+      </w:pPr>
+    </w:p>
     <w:p>
       <w:pPr>
         <w:spacing w:after="140" w:line="300" w:lineRule="auto"/>
@@ -15747,11 +15808,19 @@
           <w:lang w:val="es-BO"/>
         </w:rPr>
       </w:pPr>
-      <w:r>
-        <w:rPr>
-          <w:lang w:val="es-BO"/>
-        </w:rPr>
-        <w:lastRenderedPageBreak/>
+    </w:p>
+    <w:p>
+      <w:pPr>
+        <w:spacing w:after="140" w:line="300" w:lineRule="auto"/>
+        <w:jc w:val="both"/>
+        <w:rPr>
+          <w:lang w:val="es-BO"/>
+        </w:rPr>
+      </w:pPr>
+      <w:r>
+        <w:rPr>
+          <w:lang w:val="es-BO"/>
+        </w:rPr>
         <w:t xml:space="preserve">La existencia de </w:t>
       </w:r>
       <w:proofErr w:type="spellStart"/>
@@ -15777,7 +15846,7 @@
           <w:lang w:val="es-BO"/>
         </w:rPr>
       </w:pPr>
-      <w:bookmarkStart w:id="14" w:name="_Toc239726805"/>
+      <w:bookmarkStart w:id="14" w:name="_Toc239876612"/>
       <w:r>
         <w:rPr>
           <w:lang w:val="es-BO"/>
@@ -15960,7 +16029,7 @@
           <w:lang w:val="es-BO"/>
         </w:rPr>
       </w:pPr>
-      <w:bookmarkStart w:id="15" w:name="_Toc239726806"/>
+      <w:bookmarkStart w:id="15" w:name="_Toc239876613"/>
       <w:r>
         <w:rPr>
           <w:lang w:val="es-BO"/>
@@ -16517,7 +16586,7 @@
         <w:pStyle w:val="Heading2"/>
         <w:spacing w:before="280" w:after="140"/>
       </w:pPr>
-      <w:bookmarkStart w:id="16" w:name="_Toc239726807"/>
+      <w:bookmarkStart w:id="16" w:name="_Toc239876614"/>
       <w:r>
         <w:t xml:space="preserve">8.1 </w:t>
       </w:r>
@@ -16541,8 +16610,9 @@
         <w:pStyle w:val="Heading3"/>
         <w:spacing w:before="220" w:after="110"/>
       </w:pPr>
-      <w:bookmarkStart w:id="17" w:name="_Toc239726808"/>
-      <w:r>
+      <w:bookmarkStart w:id="17" w:name="_Toc239876615"/>
+      <w:r>
+        <w:lastRenderedPageBreak/>
         <w:t>Viaje</w:t>
       </w:r>
       <w:bookmarkEnd w:id="17"/>
@@ -16639,7 +16709,7 @@
           <w:lang w:val="es-BO"/>
         </w:rPr>
       </w:pPr>
-      <w:bookmarkStart w:id="18" w:name="_Toc239726809"/>
+      <w:bookmarkStart w:id="18" w:name="_Toc239876616"/>
       <w:r>
         <w:rPr>
           <w:lang w:val="es-BO"/>
@@ -16660,7 +16730,6 @@
         <w:rPr>
           <w:lang w:val="es-BO"/>
         </w:rPr>
-        <w:lastRenderedPageBreak/>
         <w:t>Registra cada erogación. Almacena tanto el importe como los valores de retención impositiva calculados en el momento del registro: base imponible, RC-IVA, IUE, IT e importe costo. Persistir estos valores en lugar de recalcularlos garantiza que los reportes históricos permanezcan consistentes ante eventuales cambios en las alícuotas.</w:t>
       </w:r>
     </w:p>
@@ -16729,7 +16798,7 @@
           <w:lang w:val="es-BO"/>
         </w:rPr>
       </w:pPr>
-      <w:bookmarkStart w:id="19" w:name="_Toc239726810"/>
+      <w:bookmarkStart w:id="19" w:name="_Toc239876617"/>
       <w:proofErr w:type="spellStart"/>
       <w:r>
         <w:rPr>
@@ -16791,7 +16860,7 @@
           <w:lang w:val="es-BO"/>
         </w:rPr>
       </w:pPr>
-      <w:bookmarkStart w:id="20" w:name="_Toc239726811"/>
+      <w:bookmarkStart w:id="20" w:name="_Toc239876618"/>
       <w:r>
         <w:rPr>
           <w:lang w:val="es-BO"/>
@@ -16837,7 +16906,7 @@
           <w:lang w:val="es-BO"/>
         </w:rPr>
       </w:pPr>
-      <w:bookmarkStart w:id="21" w:name="_Toc239726812"/>
+      <w:bookmarkStart w:id="21" w:name="_Toc239876619"/>
       <w:r>
         <w:rPr>
           <w:lang w:val="es-BO"/>
@@ -16883,7 +16952,7 @@
           <w:lang w:val="es-BO"/>
         </w:rPr>
       </w:pPr>
-      <w:bookmarkStart w:id="22" w:name="_Toc239726813"/>
+      <w:bookmarkStart w:id="22" w:name="_Toc239876620"/>
       <w:proofErr w:type="spellStart"/>
       <w:r>
         <w:rPr>
@@ -16917,7 +16986,7 @@
           <w:lang w:val="es-BO"/>
         </w:rPr>
       </w:pPr>
-      <w:bookmarkStart w:id="23" w:name="_Toc239726814"/>
+      <w:bookmarkStart w:id="23" w:name="_Toc239876621"/>
       <w:proofErr w:type="spellStart"/>
       <w:r>
         <w:rPr>
@@ -16940,6 +17009,7 @@
         <w:rPr>
           <w:lang w:val="es-BO"/>
         </w:rPr>
+        <w:lastRenderedPageBreak/>
         <w:t>Tabla de una sola fila que mantiene el contador de recibos emitidos. Su incremento se realiza mediante una función almacenada que actualiza y devuelve el nuevo valor en una única operación, evitando que dos emisiones simultáneas obtengan el mismo número.</w:t>
       </w:r>
     </w:p>
@@ -16951,7 +17021,7 @@
           <w:lang w:val="es-BO"/>
         </w:rPr>
       </w:pPr>
-      <w:bookmarkStart w:id="24" w:name="_Toc239726815"/>
+      <w:bookmarkStart w:id="24" w:name="_Toc239876622"/>
       <w:r>
         <w:rPr>
           <w:lang w:val="es-BO"/>
@@ -17083,7 +17153,6 @@
         <w:rPr>
           <w:lang w:val="es-BO"/>
         </w:rPr>
-        <w:lastRenderedPageBreak/>
         <w:t>Complementariamente, los servicios que comparan fechas calendario incorporan funciones auxiliares que convierten explícitamente a la zona horaria local antes de operar, evitando que una acción realizada en horario nocturno se compute como perteneciente al día siguiente.</w:t>
       </w:r>
     </w:p>
@@ -17368,7 +17437,7 @@
           <w:lang w:val="es-BO"/>
         </w:rPr>
       </w:pPr>
-      <w:bookmarkStart w:id="25" w:name="_Toc239726816"/>
+      <w:bookmarkStart w:id="25" w:name="_Toc239876623"/>
       <w:r>
         <w:rPr>
           <w:lang w:val="es-BO"/>
@@ -18570,7 +18639,7 @@
         <w:pStyle w:val="Heading1"/>
         <w:spacing w:before="360" w:after="180"/>
       </w:pPr>
-      <w:bookmarkStart w:id="26" w:name="_Toc239726817"/>
+      <w:bookmarkStart w:id="26" w:name="_Toc239876624"/>
       <w:r>
         <w:t xml:space="preserve">9. </w:t>
       </w:r>
@@ -18594,8 +18663,9 @@
         <w:pStyle w:val="Heading2"/>
         <w:spacing w:before="280" w:after="140"/>
       </w:pPr>
-      <w:bookmarkStart w:id="27" w:name="_Toc239726818"/>
-      <w:r>
+      <w:bookmarkStart w:id="27" w:name="_Toc239876625"/>
+      <w:r>
+        <w:lastRenderedPageBreak/>
         <w:t>9.1 Dominio expense</w:t>
       </w:r>
       <w:bookmarkEnd w:id="27"/>
@@ -18975,18 +19045,20 @@
           <w:lang w:val="es-BO"/>
         </w:rPr>
       </w:pPr>
-      <w:r>
-        <w:rPr>
-          <w:lang w:val="es-BO"/>
-        </w:rPr>
-        <w:t xml:space="preserve">La función de cálculo de retenciones aplica una fórmula distinta según el tipo de comprobante: los gastos con factura o recibo no generan retención; las compras sin factura aplican IUE del cinco por ciento e IT del </w:t>
-      </w:r>
-      <w:r>
-        <w:rPr>
-          <w:lang w:val="es-BO"/>
-        </w:rPr>
-        <w:lastRenderedPageBreak/>
-        <w:t>tres por ciento sobre una base incrementada; los servicios sin factura aplican RC-IVA del trece por ciento e IT del tres por ciento. Los gastos internacionales quedan exentos de todo cálculo de retención.</w:t>
+    </w:p>
+    <w:p>
+      <w:pPr>
+        <w:spacing w:after="140" w:line="300" w:lineRule="auto"/>
+        <w:jc w:val="both"/>
+        <w:rPr>
+          <w:lang w:val="es-BO"/>
+        </w:rPr>
+      </w:pPr>
+      <w:r>
+        <w:rPr>
+          <w:lang w:val="es-BO"/>
+        </w:rPr>
+        <w:t>La función de cálculo de retenciones aplica una fórmula distinta según el tipo de comprobante: los gastos con factura o recibo no generan retención; las compras sin factura aplican IUE del cinco por ciento e IT del tres por ciento sobre una base incrementada; los servicios sin factura aplican RC-IVA del trece por ciento e IT del tres por ciento. Los gastos internacionales quedan exentos de todo cálculo de retención.</w:t>
       </w:r>
     </w:p>
     <w:p>
@@ -19747,7 +19819,7 @@
         <w:pStyle w:val="Heading2"/>
         <w:spacing w:before="280" w:after="140"/>
       </w:pPr>
-      <w:bookmarkStart w:id="28" w:name="_Toc239726819"/>
+      <w:bookmarkStart w:id="28" w:name="_Toc239876626"/>
       <w:r>
         <w:t>9.2 Dominio approval</w:t>
       </w:r>
@@ -20162,6 +20234,15 @@
           <w:lang w:val="es-BO"/>
         </w:rPr>
       </w:pPr>
+    </w:p>
+    <w:p>
+      <w:pPr>
+        <w:spacing w:after="140" w:line="300" w:lineRule="auto"/>
+        <w:jc w:val="both"/>
+        <w:rPr>
+          <w:lang w:val="es-BO"/>
+        </w:rPr>
+      </w:pPr>
       <w:r>
         <w:rPr>
           <w:lang w:val="es-BO"/>
@@ -20601,6 +20682,7 @@
           <w:sz w:val="16"/>
           <w:szCs w:val="16"/>
         </w:rPr>
+        <w:lastRenderedPageBreak/>
         <w:t xml:space="preserve">  </w:t>
       </w:r>
       <w:r>
@@ -20734,7 +20816,7 @@
         <w:pStyle w:val="Heading2"/>
         <w:spacing w:before="280" w:after="140"/>
       </w:pPr>
-      <w:bookmarkStart w:id="29" w:name="_Toc239726820"/>
+      <w:bookmarkStart w:id="29" w:name="_Toc239876627"/>
       <w:r>
         <w:t>9.3 Dominio trip</w:t>
       </w:r>
@@ -20933,6 +21015,15 @@
           <w:lang w:val="es-BO"/>
         </w:rPr>
       </w:pPr>
+    </w:p>
+    <w:p>
+      <w:pPr>
+        <w:spacing w:after="140" w:line="300" w:lineRule="auto"/>
+        <w:jc w:val="both"/>
+        <w:rPr>
+          <w:lang w:val="es-BO"/>
+        </w:rPr>
+      </w:pPr>
       <w:r>
         <w:rPr>
           <w:lang w:val="es-BO"/>
@@ -20968,12 +21059,11 @@
           <w:lang w:val="es-BO"/>
         </w:rPr>
       </w:pPr>
-      <w:bookmarkStart w:id="30" w:name="_Toc239726821"/>
-      <w:r>
-        <w:rPr>
-          <w:lang w:val="es-BO"/>
-        </w:rPr>
-        <w:lastRenderedPageBreak/>
+      <w:bookmarkStart w:id="30" w:name="_Toc239876628"/>
+      <w:r>
+        <w:rPr>
+          <w:lang w:val="es-BO"/>
+        </w:rPr>
         <w:t>10. Servicios transversales</w:t>
       </w:r>
       <w:bookmarkEnd w:id="30"/>
@@ -20986,7 +21076,7 @@
           <w:lang w:val="es-BO"/>
         </w:rPr>
       </w:pPr>
-      <w:bookmarkStart w:id="31" w:name="_Toc239726822"/>
+      <w:bookmarkStart w:id="31" w:name="_Toc239876629"/>
       <w:r>
         <w:rPr>
           <w:lang w:val="es-BO"/>
@@ -21041,7 +21131,7 @@
           <w:lang w:val="es-BO"/>
         </w:rPr>
       </w:pPr>
-      <w:bookmarkStart w:id="32" w:name="_Toc239726823"/>
+      <w:bookmarkStart w:id="32" w:name="_Toc239876630"/>
       <w:r>
         <w:rPr>
           <w:lang w:val="es-BO"/>
@@ -21096,7 +21186,7 @@
           <w:lang w:val="es-BO"/>
         </w:rPr>
       </w:pPr>
-      <w:bookmarkStart w:id="33" w:name="_Toc239726824"/>
+      <w:bookmarkStart w:id="33" w:name="_Toc239876631"/>
       <w:r>
         <w:rPr>
           <w:lang w:val="es-BO"/>
@@ -21164,7 +21254,7 @@
           <w:lang w:val="es-BO"/>
         </w:rPr>
       </w:pPr>
-      <w:bookmarkStart w:id="34" w:name="_Toc239726825"/>
+      <w:bookmarkStart w:id="34" w:name="_Toc239876632"/>
       <w:r>
         <w:rPr>
           <w:lang w:val="es-BO"/>
@@ -21193,6 +21283,7 @@
         <w:rPr>
           <w:lang w:val="es-BO"/>
         </w:rPr>
+        <w:lastRenderedPageBreak/>
         <w:t>Centraliza el envío de correo transaccional a través de Brevo. Expone tres operaciones: el envío del código de verificación, la validación de existencia de una dirección mediante un servicio externo de reputación, y el envío genérico con adjuntos opcionales.</w:t>
       </w:r>
     </w:p>
@@ -21225,7 +21316,7 @@
           <w:lang w:val="es-BO"/>
         </w:rPr>
       </w:pPr>
-      <w:bookmarkStart w:id="35" w:name="_Toc239726826"/>
+      <w:bookmarkStart w:id="35" w:name="_Toc239876633"/>
       <w:r>
         <w:rPr>
           <w:lang w:val="es-BO"/>
@@ -21290,7 +21381,7 @@
         <w:pStyle w:val="Heading1"/>
         <w:spacing w:before="360" w:after="180"/>
       </w:pPr>
-      <w:bookmarkStart w:id="36" w:name="_Toc239726827"/>
+      <w:bookmarkStart w:id="36" w:name="_Toc239876634"/>
       <w:r>
         <w:t xml:space="preserve">11. </w:t>
       </w:r>
@@ -21347,7 +21438,6 @@
                 <w:sz w:val="19"/>
                 <w:szCs w:val="19"/>
               </w:rPr>
-              <w:lastRenderedPageBreak/>
               <w:t>Archivo</w:t>
             </w:r>
             <w:proofErr w:type="spellEnd"/>
@@ -21551,7 +21641,7 @@
           <w:lang w:val="es-BO"/>
         </w:rPr>
       </w:pPr>
-      <w:bookmarkStart w:id="37" w:name="_Toc239726828"/>
+      <w:bookmarkStart w:id="37" w:name="_Toc239876635"/>
       <w:r>
         <w:rPr>
           <w:lang w:val="es-BO"/>
@@ -21568,7 +21658,7 @@
           <w:lang w:val="es-BO"/>
         </w:rPr>
       </w:pPr>
-      <w:bookmarkStart w:id="38" w:name="_Toc239726829"/>
+      <w:bookmarkStart w:id="38" w:name="_Toc239876636"/>
       <w:r>
         <w:rPr>
           <w:lang w:val="es-BO"/>
@@ -22238,6 +22328,7 @@
           <w:sz w:val="16"/>
           <w:szCs w:val="16"/>
         </w:rPr>
+        <w:lastRenderedPageBreak/>
         <w:t xml:space="preserve">  return await </w:t>
       </w:r>
       <w:proofErr w:type="spellStart"/>
@@ -22370,7 +22461,7 @@
           <w:lang w:val="es-BO"/>
         </w:rPr>
       </w:pPr>
-      <w:bookmarkStart w:id="39" w:name="_Toc239726830"/>
+      <w:bookmarkStart w:id="39" w:name="_Toc239876637"/>
       <w:r>
         <w:rPr>
           <w:lang w:val="es-BO"/>
@@ -22416,12 +22507,11 @@
           <w:lang w:val="es-BO"/>
         </w:rPr>
       </w:pPr>
-      <w:bookmarkStart w:id="40" w:name="_Toc239726831"/>
-      <w:r>
-        <w:rPr>
-          <w:lang w:val="es-BO"/>
-        </w:rPr>
-        <w:lastRenderedPageBreak/>
+      <w:bookmarkStart w:id="40" w:name="_Toc239876638"/>
+      <w:r>
+        <w:rPr>
+          <w:lang w:val="es-BO"/>
+        </w:rPr>
         <w:t>12.3 Correo transaccional</w:t>
       </w:r>
       <w:bookmarkEnd w:id="40"/>
@@ -22449,7 +22539,7 @@
           <w:lang w:val="es-BO"/>
         </w:rPr>
       </w:pPr>
-      <w:bookmarkStart w:id="41" w:name="_Toc239726832"/>
+      <w:bookmarkStart w:id="41" w:name="_Toc239876639"/>
       <w:r>
         <w:rPr>
           <w:lang w:val="es-BO"/>
@@ -22466,7 +22556,7 @@
           <w:lang w:val="es-BO"/>
         </w:rPr>
       </w:pPr>
-      <w:bookmarkStart w:id="42" w:name="_Toc239726833"/>
+      <w:bookmarkStart w:id="42" w:name="_Toc239876640"/>
       <w:r>
         <w:rPr>
           <w:lang w:val="es-BO"/>
@@ -22760,7 +22850,7 @@
           <w:lang w:val="es-BO"/>
         </w:rPr>
       </w:pPr>
-      <w:bookmarkStart w:id="43" w:name="_Toc239726834"/>
+      <w:bookmarkStart w:id="43" w:name="_Toc239876641"/>
       <w:r>
         <w:rPr>
           <w:lang w:val="es-BO"/>
@@ -22819,6 +22909,7 @@
           <w:szCs w:val="16"/>
           <w:lang w:val="es-BO"/>
         </w:rPr>
+        <w:lastRenderedPageBreak/>
         <w:t xml:space="preserve">   │ el empleado confirma la finalización</w:t>
       </w:r>
     </w:p>
@@ -22982,7 +23073,7 @@
           <w:lang w:val="es-BO"/>
         </w:rPr>
       </w:pPr>
-      <w:bookmarkStart w:id="44" w:name="_Toc239726835"/>
+      <w:bookmarkStart w:id="44" w:name="_Toc239876642"/>
       <w:r>
         <w:rPr>
           <w:lang w:val="es-BO"/>
@@ -23043,7 +23134,7 @@
           <w:lang w:val="es-BO"/>
         </w:rPr>
       </w:pPr>
-      <w:bookmarkStart w:id="45" w:name="_Toc239726836"/>
+      <w:bookmarkStart w:id="45" w:name="_Toc239876643"/>
       <w:r>
         <w:rPr>
           <w:lang w:val="es-BO"/>
@@ -23064,7 +23155,6 @@
         <w:rPr>
           <w:lang w:val="es-BO"/>
         </w:rPr>
-        <w:lastRenderedPageBreak/>
         <w:t>Dado que varios supervisores pueden acceder simultáneamente a la bandeja de revisiones pendientes, la asignación de un viaje verifica que el campo de supervisor asignado se encuentre vacío antes de establecerlo. El segundo intento sobre el mismo viaje recibe un error específico que el cliente traduce en un aviso mediante un modal dedicado.</w:t>
       </w:r>
     </w:p>
@@ -23076,7 +23166,7 @@
           <w:lang w:val="es-BO"/>
         </w:rPr>
       </w:pPr>
-      <w:bookmarkStart w:id="46" w:name="_Toc239726837"/>
+      <w:bookmarkStart w:id="46" w:name="_Toc239876644"/>
       <w:r>
         <w:rPr>
           <w:lang w:val="es-BO"/>
@@ -23305,6 +23395,15 @@
           <w:lang w:val="es-BO"/>
         </w:rPr>
       </w:pPr>
+    </w:p>
+    <w:p>
+      <w:pPr>
+        <w:spacing w:after="140" w:line="300" w:lineRule="auto"/>
+        <w:jc w:val="both"/>
+        <w:rPr>
+          <w:lang w:val="es-BO"/>
+        </w:rPr>
+      </w:pPr>
       <w:r>
         <w:rPr>
           <w:lang w:val="es-BO"/>
@@ -23320,7 +23419,7 @@
           <w:lang w:val="es-BO"/>
         </w:rPr>
       </w:pPr>
-      <w:bookmarkStart w:id="47" w:name="_Toc239726838"/>
+      <w:bookmarkStart w:id="47" w:name="_Toc239876645"/>
       <w:r>
         <w:rPr>
           <w:lang w:val="es-BO"/>
@@ -23677,6 +23776,7 @@
                 <w:sz w:val="19"/>
                 <w:szCs w:val="19"/>
               </w:rPr>
+              <w:lastRenderedPageBreak/>
               <w:t>RECHAZADA</w:t>
             </w:r>
           </w:p>
@@ -23719,6 +23819,15 @@
           <w:lang w:val="es-BO"/>
         </w:rPr>
       </w:pPr>
+    </w:p>
+    <w:p>
+      <w:pPr>
+        <w:spacing w:after="140" w:line="300" w:lineRule="auto"/>
+        <w:jc w:val="both"/>
+        <w:rPr>
+          <w:lang w:val="es-BO"/>
+        </w:rPr>
+      </w:pPr>
       <w:r>
         <w:rPr>
           <w:lang w:val="es-BO"/>
@@ -23759,7 +23868,7 @@
         <w:pStyle w:val="Heading1"/>
         <w:spacing w:before="360" w:after="180"/>
       </w:pPr>
-      <w:bookmarkStart w:id="48" w:name="_Toc239726839"/>
+      <w:bookmarkStart w:id="48" w:name="_Toc239876646"/>
       <w:r>
         <w:t xml:space="preserve">15. </w:t>
       </w:r>
@@ -23933,12 +24042,11 @@
           <w:lang w:val="es-BO"/>
         </w:rPr>
       </w:pPr>
-      <w:bookmarkStart w:id="49" w:name="_Toc239726840"/>
-      <w:r>
-        <w:rPr>
-          <w:lang w:val="es-BO"/>
-        </w:rPr>
-        <w:lastRenderedPageBreak/>
+      <w:bookmarkStart w:id="49" w:name="_Toc239876647"/>
+      <w:r>
+        <w:rPr>
+          <w:lang w:val="es-BO"/>
+        </w:rPr>
         <w:t>16. Scripts de base de datos</w:t>
       </w:r>
       <w:bookmarkEnd w:id="49"/>
@@ -24267,6 +24375,15 @@
         </w:tc>
       </w:tr>
     </w:tbl>
+    <w:p>
+      <w:pPr>
+        <w:spacing w:after="140" w:line="300" w:lineRule="auto"/>
+        <w:jc w:val="both"/>
+        <w:rPr>
+          <w:lang w:val="es-BO"/>
+        </w:rPr>
+      </w:pPr>
+    </w:p>
     <w:p>
       <w:pPr>
         <w:spacing w:after="140" w:line="300" w:lineRule="auto"/>
@@ -24968,6 +25085,7 @@
   <w:style w:type="character" w:default="1" w:styleId="DefaultParagraphFont">
     <w:name w:val="Default Paragraph Font"/>
     <w:uiPriority w:val="1"/>
+    <w:semiHidden/>
     <w:unhideWhenUsed/>
   </w:style>
   <w:style w:type="table" w:default="1" w:styleId="TableNormal">

</xml_diff>